<commit_message>
Update submission document with formatting improvements
</commit_message>
<xml_diff>
--- a/AIAssignement_Sanidhya.docx
+++ b/AIAssignement_Sanidhya.docx
@@ -126,7 +126,7 @@
           <w:sz w:val="40"/>
           <w:szCs w:val="40"/>
         </w:rPr>
-        <w:t xml:space="preserve">PART A — Written Questions</w:t>
+        <w:t xml:space="preserve">PART A - Written Questions</w:t>
       </w:r>
     </w:p>
     <w:p>
@@ -236,7 +236,7 @@
           <w:sz w:val="22"/>
           <w:szCs w:val="22"/>
         </w:rPr>
-        <w:t xml:space="preserve">List key facts, numbers, and named entities — these are the anchors that must survive into the output.</w:t>
+        <w:t xml:space="preserve">List key facts, numbers, and named entities - these are the anchors that must survive into the output.</w:t>
       </w:r>
     </w:p>
     <w:p>
@@ -296,7 +296,7 @@
           <w:sz w:val="22"/>
           <w:szCs w:val="22"/>
         </w:rPr>
-        <w:t xml:space="preserve">Post-generation: do a facts-first review — check every number, date, and proper noun against the source.</w:t>
+        <w:t xml:space="preserve">Post-generation: do a facts-first review - check every number, date, and proper noun against the source.</w:t>
       </w:r>
     </w:p>
     <w:p>
@@ -332,47 +332,47 @@
           <w:sz w:val="22"/>
           <w:szCs w:val="22"/>
         </w:rPr>
-        <w:t xml:space="preserve">Identifying what is important — relevance judgement requires domain and context knowledge the model lacks.</w:t>
-      </w:r>
-    </w:p>
-    <w:p>
-      <w:pPr>
-        <w:pStyle w:val="ListParagraph"/>
-        <w:numPr>
-          <w:ilvl w:val="0"/>
-          <w:numId w:val="2"/>
-        </w:numPr>
-        <w:spacing w:after="40" w:before="40"/>
-      </w:pPr>
-      <w:r>
-        <w:rPr>
-          <w:rFonts w:ascii="Arial" w:cs="Arial" w:eastAsia="Arial" w:hAnsi="Arial"/>
-          <w:b w:val="false"/>
-          <w:bCs w:val="false"/>
-          <w:sz w:val="22"/>
-          <w:szCs w:val="22"/>
-        </w:rPr>
-        <w:t xml:space="preserve">Fact verification — the model cannot check whether a number in its output matches the source document.</w:t>
-      </w:r>
-    </w:p>
-    <w:p>
-      <w:pPr>
-        <w:pStyle w:val="ListParagraph"/>
-        <w:numPr>
-          <w:ilvl w:val="0"/>
-          <w:numId w:val="2"/>
-        </w:numPr>
-        <w:spacing w:after="40" w:before="40"/>
-      </w:pPr>
-      <w:r>
-        <w:rPr>
-          <w:rFonts w:ascii="Arial" w:cs="Arial" w:eastAsia="Arial" w:hAnsi="Arial"/>
-          <w:b w:val="false"/>
-          <w:bCs w:val="false"/>
-          <w:sz w:val="22"/>
-          <w:szCs w:val="22"/>
-        </w:rPr>
-        <w:t xml:space="preserve">Deciding the output structure — this depends on the audience and use case, not the content alone.</w:t>
+        <w:t xml:space="preserve">Identifying what is important - relevance judgement requires domain and context knowledge the model lacks.</w:t>
+      </w:r>
+    </w:p>
+    <w:p>
+      <w:pPr>
+        <w:pStyle w:val="ListParagraph"/>
+        <w:numPr>
+          <w:ilvl w:val="0"/>
+          <w:numId w:val="2"/>
+        </w:numPr>
+        <w:spacing w:after="40" w:before="40"/>
+      </w:pPr>
+      <w:r>
+        <w:rPr>
+          <w:rFonts w:ascii="Arial" w:cs="Arial" w:eastAsia="Arial" w:hAnsi="Arial"/>
+          <w:b w:val="false"/>
+          <w:bCs w:val="false"/>
+          <w:sz w:val="22"/>
+          <w:szCs w:val="22"/>
+        </w:rPr>
+        <w:t xml:space="preserve">Fact verification - the model cannot check whether a number in its output matches the source document.</w:t>
+      </w:r>
+    </w:p>
+    <w:p>
+      <w:pPr>
+        <w:pStyle w:val="ListParagraph"/>
+        <w:numPr>
+          <w:ilvl w:val="0"/>
+          <w:numId w:val="2"/>
+        </w:numPr>
+        <w:spacing w:after="40" w:before="40"/>
+      </w:pPr>
+      <w:r>
+        <w:rPr>
+          <w:rFonts w:ascii="Arial" w:cs="Arial" w:eastAsia="Arial" w:hAnsi="Arial"/>
+          <w:b w:val="false"/>
+          <w:bCs w:val="false"/>
+          <w:sz w:val="22"/>
+          <w:szCs w:val="22"/>
+        </w:rPr>
+        <w:t xml:space="preserve">Deciding the output structure - this depends on the audience and use case, not the content alone.</w:t>
       </w:r>
     </w:p>
     <w:p>
@@ -624,7 +624,7 @@
           <w:sz w:val="22"/>
           <w:szCs w:val="22"/>
         </w:rPr>
-        <w:t xml:space="preserve">Conflating generation with extraction is the most common mistake — people expect the model to faithfully extract but it subtly rephrases, omitting or adding detail.</w:t>
+        <w:t xml:space="preserve">Conflating generation with extraction is the most common mistake - people expect the model to faithfully extract but it subtly rephrases, omitting or adding detail.</w:t>
       </w:r>
     </w:p>
     <w:p>
@@ -686,127 +686,127 @@
           <w:sz w:val="22"/>
           <w:szCs w:val="22"/>
         </w:rPr>
-        <w:t xml:space="preserve">Step 1 — Upload: User uploads one or more source documents (PDFs, Word files) and fills a short intake form specifying: report purpose, target audience, and any must-include sections.</w:t>
-      </w:r>
-    </w:p>
-    <w:p>
-      <w:pPr>
-        <w:pStyle w:val="ListParagraph"/>
-        <w:numPr>
-          <w:ilvl w:val="0"/>
-          <w:numId w:val="2"/>
-        </w:numPr>
-        <w:spacing w:after="40" w:before="40"/>
-      </w:pPr>
-      <w:r>
-        <w:rPr>
-          <w:rFonts w:ascii="Arial" w:cs="Arial" w:eastAsia="Arial" w:hAnsi="Arial"/>
-          <w:b w:val="false"/>
-          <w:bCs w:val="false"/>
-          <w:sz w:val="22"/>
-          <w:szCs w:val="22"/>
-        </w:rPr>
-        <w:t xml:space="preserve">Step 2 — Pre-processing: The system extracts plain text, splits into logical chunks, and stores them with source references (page numbers, section titles).</w:t>
-      </w:r>
-    </w:p>
-    <w:p>
-      <w:pPr>
-        <w:pStyle w:val="ListParagraph"/>
-        <w:numPr>
-          <w:ilvl w:val="0"/>
-          <w:numId w:val="2"/>
-        </w:numPr>
-        <w:spacing w:after="40" w:before="40"/>
-      </w:pPr>
-      <w:r>
-        <w:rPr>
-          <w:rFonts w:ascii="Arial" w:cs="Arial" w:eastAsia="Arial" w:hAnsi="Arial"/>
-          <w:b w:val="false"/>
-          <w:bCs w:val="false"/>
-          <w:sz w:val="22"/>
-          <w:szCs w:val="22"/>
-        </w:rPr>
-        <w:t xml:space="preserve">Step 3 — Structure planning: A planning pass proposes a report outline based on the intake form. The user reviews and approves or edits the outline before any drafting begins.</w:t>
-      </w:r>
-    </w:p>
-    <w:p>
-      <w:pPr>
-        <w:pStyle w:val="ListParagraph"/>
-        <w:numPr>
-          <w:ilvl w:val="0"/>
-          <w:numId w:val="2"/>
-        </w:numPr>
-        <w:spacing w:after="40" w:before="40"/>
-      </w:pPr>
-      <w:r>
-        <w:rPr>
-          <w:rFonts w:ascii="Arial" w:cs="Arial" w:eastAsia="Arial" w:hAnsi="Arial"/>
-          <w:b w:val="false"/>
-          <w:bCs w:val="false"/>
-          <w:sz w:val="22"/>
-          <w:szCs w:val="22"/>
-        </w:rPr>
-        <w:t xml:space="preserve">Step 4 — Drafting: The system generates each section one at a time, grounding every paragraph in specific source chunks.</w:t>
-      </w:r>
-    </w:p>
-    <w:p>
-      <w:pPr>
-        <w:pStyle w:val="ListParagraph"/>
-        <w:numPr>
-          <w:ilvl w:val="0"/>
-          <w:numId w:val="2"/>
-        </w:numPr>
-        <w:spacing w:after="40" w:before="40"/>
-      </w:pPr>
-      <w:r>
-        <w:rPr>
-          <w:rFonts w:ascii="Arial" w:cs="Arial" w:eastAsia="Arial" w:hAnsi="Arial"/>
-          <w:b w:val="false"/>
-          <w:bCs w:val="false"/>
-          <w:sz w:val="22"/>
-          <w:szCs w:val="22"/>
-        </w:rPr>
-        <w:t xml:space="preserve">Step 5 — Review interface: The user sees a side-by-side view of the draft and the source passages used. They can accept, reject, or rephrase any paragraph.</w:t>
-      </w:r>
-    </w:p>
-    <w:p>
-      <w:pPr>
-        <w:pStyle w:val="ListParagraph"/>
-        <w:numPr>
-          <w:ilvl w:val="0"/>
-          <w:numId w:val="2"/>
-        </w:numPr>
-        <w:spacing w:after="40" w:before="40"/>
-      </w:pPr>
-      <w:r>
-        <w:rPr>
-          <w:rFonts w:ascii="Arial" w:cs="Arial" w:eastAsia="Arial" w:hAnsi="Arial"/>
-          <w:b w:val="false"/>
-          <w:bCs w:val="false"/>
-          <w:sz w:val="22"/>
-          <w:szCs w:val="22"/>
-        </w:rPr>
-        <w:t xml:space="preserve">Step 6 — Revision: The system incorporates the user's edits and regenerates only the affected sections.</w:t>
-      </w:r>
-    </w:p>
-    <w:p>
-      <w:pPr>
-        <w:pStyle w:val="ListParagraph"/>
-        <w:numPr>
-          <w:ilvl w:val="0"/>
-          <w:numId w:val="2"/>
-        </w:numPr>
-        <w:spacing w:after="40" w:before="40"/>
-      </w:pPr>
-      <w:r>
-        <w:rPr>
-          <w:rFonts w:ascii="Arial" w:cs="Arial" w:eastAsia="Arial" w:hAnsi="Arial"/>
-          <w:b w:val="false"/>
-          <w:bCs w:val="false"/>
-          <w:sz w:val="22"/>
-          <w:szCs w:val="22"/>
-        </w:rPr>
-        <w:t xml:space="preserve">Step 7 — Final output: The user exports the reviewed document as PDF or Word.</w:t>
+        <w:t xml:space="preserve">Step 1 - Upload: User uploads one or more source documents (PDFs, Word files) and fills a short intake form specifying: report purpose, target audience, and any must-include sections.</w:t>
+      </w:r>
+    </w:p>
+    <w:p>
+      <w:pPr>
+        <w:pStyle w:val="ListParagraph"/>
+        <w:numPr>
+          <w:ilvl w:val="0"/>
+          <w:numId w:val="2"/>
+        </w:numPr>
+        <w:spacing w:after="40" w:before="40"/>
+      </w:pPr>
+      <w:r>
+        <w:rPr>
+          <w:rFonts w:ascii="Arial" w:cs="Arial" w:eastAsia="Arial" w:hAnsi="Arial"/>
+          <w:b w:val="false"/>
+          <w:bCs w:val="false"/>
+          <w:sz w:val="22"/>
+          <w:szCs w:val="22"/>
+        </w:rPr>
+        <w:t xml:space="preserve">Step 2 - Pre-processing: The system extracts plain text, splits into logical chunks, and stores them with source references (page numbers, section titles).</w:t>
+      </w:r>
+    </w:p>
+    <w:p>
+      <w:pPr>
+        <w:pStyle w:val="ListParagraph"/>
+        <w:numPr>
+          <w:ilvl w:val="0"/>
+          <w:numId w:val="2"/>
+        </w:numPr>
+        <w:spacing w:after="40" w:before="40"/>
+      </w:pPr>
+      <w:r>
+        <w:rPr>
+          <w:rFonts w:ascii="Arial" w:cs="Arial" w:eastAsia="Arial" w:hAnsi="Arial"/>
+          <w:b w:val="false"/>
+          <w:bCs w:val="false"/>
+          <w:sz w:val="22"/>
+          <w:szCs w:val="22"/>
+        </w:rPr>
+        <w:t xml:space="preserve">Step 3 - Structure planning: A planning pass proposes a report outline based on the intake form. The user reviews and approves or edits the outline before any drafting begins.</w:t>
+      </w:r>
+    </w:p>
+    <w:p>
+      <w:pPr>
+        <w:pStyle w:val="ListParagraph"/>
+        <w:numPr>
+          <w:ilvl w:val="0"/>
+          <w:numId w:val="2"/>
+        </w:numPr>
+        <w:spacing w:after="40" w:before="40"/>
+      </w:pPr>
+      <w:r>
+        <w:rPr>
+          <w:rFonts w:ascii="Arial" w:cs="Arial" w:eastAsia="Arial" w:hAnsi="Arial"/>
+          <w:b w:val="false"/>
+          <w:bCs w:val="false"/>
+          <w:sz w:val="22"/>
+          <w:szCs w:val="22"/>
+        </w:rPr>
+        <w:t xml:space="preserve">Step 4 - Drafting: The system generates each section one at a time, grounding every paragraph in specific source chunks.</w:t>
+      </w:r>
+    </w:p>
+    <w:p>
+      <w:pPr>
+        <w:pStyle w:val="ListParagraph"/>
+        <w:numPr>
+          <w:ilvl w:val="0"/>
+          <w:numId w:val="2"/>
+        </w:numPr>
+        <w:spacing w:after="40" w:before="40"/>
+      </w:pPr>
+      <w:r>
+        <w:rPr>
+          <w:rFonts w:ascii="Arial" w:cs="Arial" w:eastAsia="Arial" w:hAnsi="Arial"/>
+          <w:b w:val="false"/>
+          <w:bCs w:val="false"/>
+          <w:sz w:val="22"/>
+          <w:szCs w:val="22"/>
+        </w:rPr>
+        <w:t xml:space="preserve">Step 5 - Review interface: The user sees a side-by-side view of the draft and the source passages used. They can accept, reject, or rephrase any paragraph.</w:t>
+      </w:r>
+    </w:p>
+    <w:p>
+      <w:pPr>
+        <w:pStyle w:val="ListParagraph"/>
+        <w:numPr>
+          <w:ilvl w:val="0"/>
+          <w:numId w:val="2"/>
+        </w:numPr>
+        <w:spacing w:after="40" w:before="40"/>
+      </w:pPr>
+      <w:r>
+        <w:rPr>
+          <w:rFonts w:ascii="Arial" w:cs="Arial" w:eastAsia="Arial" w:hAnsi="Arial"/>
+          <w:b w:val="false"/>
+          <w:bCs w:val="false"/>
+          <w:sz w:val="22"/>
+          <w:szCs w:val="22"/>
+        </w:rPr>
+        <w:t xml:space="preserve">Step 6 - Revision: The system incorporates the user's edits and regenerates only the affected sections.</w:t>
+      </w:r>
+    </w:p>
+    <w:p>
+      <w:pPr>
+        <w:pStyle w:val="ListParagraph"/>
+        <w:numPr>
+          <w:ilvl w:val="0"/>
+          <w:numId w:val="2"/>
+        </w:numPr>
+        <w:spacing w:after="40" w:before="40"/>
+      </w:pPr>
+      <w:r>
+        <w:rPr>
+          <w:rFonts w:ascii="Arial" w:cs="Arial" w:eastAsia="Arial" w:hAnsi="Arial"/>
+          <w:b w:val="false"/>
+          <w:bCs w:val="false"/>
+          <w:sz w:val="22"/>
+          <w:szCs w:val="22"/>
+        </w:rPr>
+        <w:t xml:space="preserve">Step 7 - Final output: The user exports the reviewed document as PDF or Word.</w:t>
       </w:r>
     </w:p>
     <w:p>
@@ -884,7 +884,7 @@
           <w:sz w:val="22"/>
           <w:szCs w:val="22"/>
         </w:rPr>
-        <w:t xml:space="preserve">Passwords and API keys — even hashed ones should not appear in application logs.</w:t>
+        <w:t xml:space="preserve">Passwords and API keys - even hashed ones should not appear in application logs.</w:t>
       </w:r>
     </w:p>
     <w:p>
@@ -1000,7 +1000,7 @@
           <w:sz w:val="22"/>
           <w:szCs w:val="22"/>
         </w:rPr>
-        <w:t xml:space="preserve">Logging entire request bodies — when a body contains a password field, it ends up in plaintext in the log file.</w:t>
+        <w:t xml:space="preserve">Logging entire request bodies - when a body contains a password field, it ends up in plaintext in the log file.</w:t>
       </w:r>
     </w:p>
     <w:p>
@@ -1117,27 +1117,27 @@
           <w:sz w:val="22"/>
           <w:szCs w:val="22"/>
         </w:rPr>
-        <w:t xml:space="preserve">Option A — Synthetic data generation: Create realistic-looking fake records with a library like Faker. Advantage: you control edge cases, no privacy risk, can be committed to the repo. Disadvantage: may miss distributional quirks of real data (e.g., encoding oddities, uncommon characters, rare formats).</w:t>
-      </w:r>
-    </w:p>
-    <w:p>
-      <w:pPr>
-        <w:pStyle w:val="ListParagraph"/>
-        <w:numPr>
-          <w:ilvl w:val="0"/>
-          <w:numId w:val="2"/>
-        </w:numPr>
-        <w:spacing w:after="40" w:before="40"/>
-      </w:pPr>
-      <w:r>
-        <w:rPr>
-          <w:rFonts w:ascii="Arial" w:cs="Arial" w:eastAsia="Arial" w:hAnsi="Arial"/>
-          <w:b w:val="false"/>
-          <w:bCs w:val="false"/>
-          <w:sz w:val="22"/>
-          <w:szCs w:val="22"/>
-        </w:rPr>
-        <w:t xml:space="preserve">Option B — Anonymised production data: Copy real data, then strip or replace every PII field before it leaves the production environment. Advantage: retains real-world distribution and edge cases. Disadvantage: anonymisation is hard to do completely — quasi-identifiers can re-identify individuals; requires a careful review pipeline before data leaves production.</w:t>
+        <w:t xml:space="preserve">Option A - Synthetic data generation: Create realistic-looking fake records with a library like Faker. Advantage: you control edge cases, no privacy risk, can be committed to the repo. Disadvantage: may miss distributional quirks of real data (e.g., encoding oddities, uncommon characters, rare formats).</w:t>
+      </w:r>
+    </w:p>
+    <w:p>
+      <w:pPr>
+        <w:pStyle w:val="ListParagraph"/>
+        <w:numPr>
+          <w:ilvl w:val="0"/>
+          <w:numId w:val="2"/>
+        </w:numPr>
+        <w:spacing w:after="40" w:before="40"/>
+      </w:pPr>
+      <w:r>
+        <w:rPr>
+          <w:rFonts w:ascii="Arial" w:cs="Arial" w:eastAsia="Arial" w:hAnsi="Arial"/>
+          <w:b w:val="false"/>
+          <w:bCs w:val="false"/>
+          <w:sz w:val="22"/>
+          <w:szCs w:val="22"/>
+        </w:rPr>
+        <w:t xml:space="preserve">Option B - Anonymised production data: Copy real data, then strip or replace every PII field before it leaves the production environment. Advantage: retains real-world distribution and edge cases. Disadvantage: anonymisation is hard to do completely - quasi-identifiers can re-identify individuals; requires a careful review pipeline before data leaves production.</w:t>
       </w:r>
     </w:p>
     <w:p>
@@ -1162,7 +1162,7 @@
           <w:sz w:val="32"/>
           <w:szCs w:val="32"/>
         </w:rPr>
-        <w:t xml:space="preserve">Section 4: Python — Reasoning-First Questions</w:t>
+        <w:t xml:space="preserve">Section 4: Python - Reasoning-First Questions</w:t>
       </w:r>
     </w:p>
     <w:p>
@@ -1634,7 +1634,7 @@
           <w:sz w:val="22"/>
           <w:szCs w:val="22"/>
         </w:rPr>
-        <w:t xml:space="preserve">One limitation: the aggregate step is naive — it concatenates results but does not resolve contradictions or duplications that arise when a fact spans a chunk boundary. Improvement: add a final 'reconciliation' pass that de-duplicates and coherence-checks the combined output.</w:t>
+        <w:t xml:space="preserve">One limitation: the aggregate step is naive - it concatenates results but does not resolve contradictions or duplications that arise when a fact spans a chunk boundary. Improvement: add a final 'reconciliation' pass that de-duplicates and coherence-checks the combined output.</w:t>
       </w:r>
     </w:p>
     <w:p>
@@ -2149,7 +2149,7 @@
           <w:sz w:val="22"/>
           <w:szCs w:val="22"/>
         </w:rPr>
-        <w:t xml:space="preserve">All items are processed sequentially — no parallelism is possible or needed.</w:t>
+        <w:t xml:space="preserve">All items are processed sequentially - no parallelism is possible or needed.</w:t>
       </w:r>
     </w:p>
     <w:p>
@@ -2185,47 +2185,47 @@
           <w:sz w:val="22"/>
           <w:szCs w:val="22"/>
         </w:rPr>
-        <w:t xml:space="preserve">process() raises an exception mid-loop — results is silently incomplete; the caller never knows which items succeeded.</w:t>
-      </w:r>
-    </w:p>
-    <w:p>
-      <w:pPr>
-        <w:pStyle w:val="ListParagraph"/>
-        <w:numPr>
-          <w:ilvl w:val="0"/>
-          <w:numId w:val="2"/>
-        </w:numPr>
-        <w:spacing w:after="40" w:before="40"/>
-      </w:pPr>
-      <w:r>
-        <w:rPr>
-          <w:rFonts w:ascii="Arial" w:cs="Arial" w:eastAsia="Arial" w:hAnsi="Arial"/>
-          <w:b w:val="false"/>
-          <w:bCs w:val="false"/>
-          <w:sz w:val="22"/>
-          <w:szCs w:val="22"/>
-        </w:rPr>
-        <w:t xml:space="preserve">process() returns None for certain inputs — results contains None values that crash downstream code.</w:t>
-      </w:r>
-    </w:p>
-    <w:p>
-      <w:pPr>
-        <w:pStyle w:val="ListParagraph"/>
-        <w:numPr>
-          <w:ilvl w:val="0"/>
-          <w:numId w:val="2"/>
-        </w:numPr>
-        <w:spacing w:after="40" w:before="40"/>
-      </w:pPr>
-      <w:r>
-        <w:rPr>
-          <w:rFonts w:ascii="Arial" w:cs="Arial" w:eastAsia="Arial" w:hAnsi="Arial"/>
-          <w:b w:val="false"/>
-          <w:bCs w:val="false"/>
-          <w:sz w:val="22"/>
-          <w:szCs w:val="22"/>
-        </w:rPr>
-        <w:t xml:space="preserve">items is very large — the entire results list accumulates in memory; at a million items this is a problem.</w:t>
+        <w:t xml:space="preserve">process() raises an exception mid-loop - results is silently incomplete; the caller never knows which items succeeded.</w:t>
+      </w:r>
+    </w:p>
+    <w:p>
+      <w:pPr>
+        <w:pStyle w:val="ListParagraph"/>
+        <w:numPr>
+          <w:ilvl w:val="0"/>
+          <w:numId w:val="2"/>
+        </w:numPr>
+        <w:spacing w:after="40" w:before="40"/>
+      </w:pPr>
+      <w:r>
+        <w:rPr>
+          <w:rFonts w:ascii="Arial" w:cs="Arial" w:eastAsia="Arial" w:hAnsi="Arial"/>
+          <w:b w:val="false"/>
+          <w:bCs w:val="false"/>
+          <w:sz w:val="22"/>
+          <w:szCs w:val="22"/>
+        </w:rPr>
+        <w:t xml:space="preserve">process() returns None for certain inputs - results contains None values that crash downstream code.</w:t>
+      </w:r>
+    </w:p>
+    <w:p>
+      <w:pPr>
+        <w:pStyle w:val="ListParagraph"/>
+        <w:numPr>
+          <w:ilvl w:val="0"/>
+          <w:numId w:val="2"/>
+        </w:numPr>
+        <w:spacing w:after="40" w:before="40"/>
+      </w:pPr>
+      <w:r>
+        <w:rPr>
+          <w:rFonts w:ascii="Arial" w:cs="Arial" w:eastAsia="Arial" w:hAnsi="Arial"/>
+          <w:b w:val="false"/>
+          <w:bCs w:val="false"/>
+          <w:sz w:val="22"/>
+          <w:szCs w:val="22"/>
+        </w:rPr>
+        <w:t xml:space="preserve">items is very large - the entire results list accumulates in memory; at a million items this is a problem.</w:t>
       </w:r>
     </w:p>
     <w:p>
@@ -2485,7 +2485,7 @@
           <w:sz w:val="22"/>
           <w:szCs w:val="22"/>
         </w:rPr>
-        <w:t xml:space="preserve">I completely understand your frustration — getting something wrong is not acceptable, and your reaction is the right one. AI systems like this one generate outputs based on patterns, and they can be confidently wrong, especially on specific details, numbers, or niche topics. This is not a flaw in how you used the tool; it is a known limitation of the technology. What helps most is treating AI output as a first draft that always needs a quick sense-check, rather than a final answer. I will look at what specifically went wrong so we can add a check that catches this type of error in the future. In the meantime, I am happy to walk through the output with you and flag anything else that needs verification.</w:t>
+        <w:t xml:space="preserve">I completely understand your frustration - getting something wrong is not acceptable, and your reaction is the right one. AI systems like this one generate outputs based on patterns, and they can be confidently wrong, especially on specific details, numbers, or niche topics. This is not a flaw in how you used the tool; it is a known limitation of the technology. What helps most is treating AI output as a first draft that always needs a quick sense-check, rather than a final answer. I will look at what specifically went wrong so we can add a check that catches this type of error in the future. In the meantime, I am happy to walk through the output with you and flag anything else that needs verification.</w:t>
       </w:r>
     </w:p>
     <w:p>
@@ -2510,7 +2510,7 @@
           <w:sz w:val="32"/>
           <w:szCs w:val="32"/>
         </w:rPr>
-        <w:t xml:space="preserve">Section 6: Reflection on AI Usage — PART A</w:t>
+        <w:t xml:space="preserve">Section 6: Reflection on AI Usage - PART A</w:t>
       </w:r>
     </w:p>
     <w:p>
@@ -2547,7 +2547,7 @@
           <w:sz w:val="22"/>
           <w:szCs w:val="22"/>
         </w:rPr>
-        <w:t xml:space="preserve">a. Yes — I used Claude (Anthropic) while working through this assignment.</w:t>
+        <w:t xml:space="preserve">a. Yes - I used Claude (Anthropic) while working through this assignment.</w:t>
       </w:r>
     </w:p>
     <w:p>
@@ -2611,7 +2611,7 @@
           <w:sz w:val="40"/>
           <w:szCs w:val="40"/>
         </w:rPr>
-        <w:t xml:space="preserve">PART B — Technical Build: Agent Registry</w:t>
+        <w:t xml:space="preserve">PART B - Technical Build: Agent Registry</w:t>
       </w:r>
     </w:p>
     <w:p>
@@ -2745,7 +2745,7 @@
           <w:sz w:val="32"/>
           <w:szCs w:val="32"/>
         </w:rPr>
-        <w:t xml:space="preserve">main.py — Full Source Code</w:t>
+        <w:t xml:space="preserve">main.py - Full Source Code</w:t>
       </w:r>
     </w:p>
     <w:p>
@@ -4484,7 +4484,7 @@
           <w:sz w:val="22"/>
           <w:szCs w:val="22"/>
         </w:rPr>
-        <w:t xml:space="preserve">A billing job reads only un-billed records, charges via payment processor, then marks them billed inside a transaction — only on confirmed success.</w:t>
+        <w:t xml:space="preserve">A billing job reads only un-billed records, charges via payment processor, then marks them billed inside a transaction - only on confirmed success.</w:t>
       </w:r>
     </w:p>
     <w:p>
@@ -4611,27 +4611,27 @@
           <w:sz w:val="32"/>
           <w:szCs w:val="32"/>
         </w:rPr>
-        <w:t xml:space="preserve">Reflection on AI Usage — PART B</w:t>
-      </w:r>
-    </w:p>
-    <w:p>
-      <w:pPr>
-        <w:pStyle w:val="ListParagraph"/>
-        <w:numPr>
-          <w:ilvl w:val="0"/>
-          <w:numId w:val="2"/>
-        </w:numPr>
-        <w:spacing w:after="40" w:before="40"/>
-      </w:pPr>
-      <w:r>
-        <w:rPr>
-          <w:rFonts w:ascii="Arial" w:cs="Arial" w:eastAsia="Arial" w:hAnsi="Arial"/>
-          <w:b w:val="false"/>
-          <w:bCs w:val="false"/>
-          <w:sz w:val="22"/>
-          <w:szCs w:val="22"/>
-        </w:rPr>
-        <w:t xml:space="preserve">a. Yes — I used Claude while writing the FastAPI code.</w:t>
+        <w:t xml:space="preserve">Reflection on AI Usage - PART B</w:t>
+      </w:r>
+    </w:p>
+    <w:p>
+      <w:pPr>
+        <w:pStyle w:val="ListParagraph"/>
+        <w:numPr>
+          <w:ilvl w:val="0"/>
+          <w:numId w:val="2"/>
+        </w:numPr>
+        <w:spacing w:after="40" w:before="40"/>
+      </w:pPr>
+      <w:r>
+        <w:rPr>
+          <w:rFonts w:ascii="Arial" w:cs="Arial" w:eastAsia="Arial" w:hAnsi="Arial"/>
+          <w:b w:val="false"/>
+          <w:bCs w:val="false"/>
+          <w:sz w:val="22"/>
+          <w:szCs w:val="22"/>
+        </w:rPr>
+        <w:t xml:space="preserve">a. Yes - I used Claude while writing the FastAPI code.</w:t>
       </w:r>
     </w:p>
     <w:p>

</xml_diff>